<commit_message>
docs: clarify real assets in image workflow
</commit_message>
<xml_diff>
--- a/doc/image-generation-workflow-guide.docx
+++ b/doc/image-generation-workflow-guide.docx
@@ -625,7 +625,7 @@
           <w:b w:val="0"/>
           <w:sz w:val="32"/>
         </w:rPr>
-        <w:t>QR Code และโลโก้ต้องใช้ไฟล์จริง ห้ามให้ AI สร้างเอง</w:t>
+        <w:t>ห้ามให้ AI สร้าง QR Code หรือโลโก้เอง แต่ต้องนำไฟล์จริงที่เตรียมไว้ไปประกอบใน layout</w:t>
       </w:r>
     </w:p>
     <w:p>
@@ -638,7 +638,20 @@
           <w:b w:val="0"/>
           <w:sz w:val="32"/>
         </w:rPr>
-        <w:t>ข้อความสำคัญต้องวางด้วย layout tool ไม่ฝังในภาพ AI</w:t>
+        <w:t>ข้อความสำคัญต้องวางด้วย layout tool หรือ HTML/CSS ไม่ฝังในภาพ AI</w:t>
+      </w:r>
+    </w:p>
+    <w:p>
+      <w:pPr>
+        <w:pStyle w:val="ListBullet"/>
+      </w:pPr>
+      <w:r>
+        <w:rPr>
+          <w:rFonts w:ascii="TH Sarabun New" w:hAnsi="TH Sarabun New" w:eastAsia="TH Sarabun New"/>
+          <w:b w:val="0"/>
+          <w:sz w:val="32"/>
+        </w:rPr>
+        <w:t>Codex ต้องช่วยวางข้อความจริง โลโก้จริง และ QR จริงให้จบเป็นไฟล์พร้อมตรวจ</w:t>
       </w:r>
     </w:p>
     <w:p>
@@ -665,6 +678,68 @@
           <w:sz w:val="32"/>
         </w:rPr>
         <w:t>ทุกไฟล์ที่ใช้งานจริงต้องเก็บ path ชัดเจนใน workspace</w:t>
+      </w:r>
+    </w:p>
+    <w:p>
+      <w:r>
+        <w:rPr>
+          <w:rFonts w:ascii="TH Sarabun New" w:hAnsi="TH Sarabun New" w:eastAsia="TH Sarabun New"/>
+          <w:b/>
+          <w:sz w:val="44"/>
+        </w:rPr>
+        <w:t>ไฟล์จริงที่ต้องนำมาประกอบ</w:t>
+      </w:r>
+    </w:p>
+    <w:p>
+      <w:pPr>
+        <w:pStyle w:val="ListBullet"/>
+      </w:pPr>
+      <w:r>
+        <w:rPr>
+          <w:rFonts w:ascii="TH Sarabun New" w:hAnsi="TH Sarabun New" w:eastAsia="TH Sarabun New"/>
+          <w:b w:val="0"/>
+          <w:sz w:val="32"/>
+        </w:rPr>
+        <w:t>โลโก้มหาวิทยาลัยนครพนม: doc/illustrations/logo_NPU.png</w:t>
+      </w:r>
+    </w:p>
+    <w:p>
+      <w:pPr>
+        <w:pStyle w:val="ListBullet"/>
+      </w:pPr>
+      <w:r>
+        <w:rPr>
+          <w:rFonts w:ascii="TH Sarabun New" w:hAnsi="TH Sarabun New" w:eastAsia="TH Sarabun New"/>
+          <w:b w:val="0"/>
+          <w:sz w:val="32"/>
+        </w:rPr>
+        <w:t>โลโก้สำนักวิทยบริการ: doc/illustrations/logo_ARC.png</w:t>
+      </w:r>
+    </w:p>
+    <w:p>
+      <w:pPr>
+        <w:pStyle w:val="ListBullet"/>
+      </w:pPr>
+      <w:r>
+        <w:rPr>
+          <w:rFonts w:ascii="TH Sarabun New" w:hAnsi="TH Sarabun New" w:eastAsia="TH Sarabun New"/>
+          <w:b w:val="0"/>
+          <w:sz w:val="32"/>
+        </w:rPr>
+        <w:t>QR Code LINE OA: doc/illustrations/QR_LINEOA_ARC.jpg</w:t>
+      </w:r>
+    </w:p>
+    <w:p>
+      <w:pPr>
+        <w:pStyle w:val="ListBullet"/>
+      </w:pPr>
+      <w:r>
+        <w:rPr>
+          <w:rFonts w:ascii="TH Sarabun New" w:hAnsi="TH Sarabun New" w:eastAsia="TH Sarabun New"/>
+          <w:b w:val="0"/>
+          <w:sz w:val="32"/>
+        </w:rPr>
+        <w:t>QR Code ระบบจอง: doc/illustrations/QR_WebApp_ARC.png</w:t>
       </w:r>
     </w:p>
     <w:p>
@@ -746,7 +821,7 @@
           <w:b/>
           <w:sz w:val="36"/>
         </w:rPr>
-        <w:t>ไม่ให้ AI ทำ</w:t>
+        <w:t>ไม่ให้ AI สร้างเอง</w:t>
       </w:r>
     </w:p>
     <w:p>
@@ -759,7 +834,7 @@
           <w:b w:val="0"/>
           <w:sz w:val="32"/>
         </w:rPr>
-        <w:t>QR Code</w:t>
+        <w:t>QR Code ปลอม</w:t>
       </w:r>
     </w:p>
     <w:p>
@@ -772,7 +847,7 @@
           <w:b w:val="0"/>
           <w:sz w:val="32"/>
         </w:rPr>
-        <w:t>โลโก้</w:t>
+        <w:t>โลโก้ปลอม</w:t>
       </w:r>
     </w:p>
     <w:p>
@@ -785,7 +860,7 @@
           <w:b w:val="0"/>
           <w:sz w:val="32"/>
         </w:rPr>
-        <w:t>ข้อความไทยยาว ๆ</w:t>
+        <w:t>ข้อความไทยยาว ๆ ในภาพ AI</w:t>
       </w:r>
     </w:p>
     <w:p>
@@ -799,6 +874,16 @@
           <w:sz w:val="32"/>
         </w:rPr>
         <w:t>ตัดสินข้อมูลนโยบายเอง</w:t>
+      </w:r>
+    </w:p>
+    <w:p>
+      <w:r>
+        <w:rPr>
+          <w:rFonts w:ascii="TH Sarabun New" w:hAnsi="TH Sarabun New" w:eastAsia="TH Sarabun New"/>
+          <w:b w:val="0"/>
+          <w:sz w:val="32"/>
+        </w:rPr>
+        <w:t>แต่ในขั้น LAYOUT DRAFT และ EXPORT ต้องนำ QR Code จริง โลโก้จริง และข้อความจริงมาประกอบให้เสร็จ</w:t>
       </w:r>
     </w:p>
     <w:p>

</xml_diff>

<commit_message>
docs: add INDEX.md and push all pending doc files
- สร้าง doc/INDEX.md — ดัชนีรวม link ทุกเอกสาร แบ่งเป็น timeline พัฒนา, คู่มือ, รายงาน, สื่อประชาสัมพันธ์, เทคนิค และ scripts
- เพิ่มไฟล์เอกสารที่ค้าง stage: architecture-flow, iot-flow, infographic, promo-signage, report-management-2568, admin-manual-v2, user-manual-v1, scripts ทั้งหมด

Co-Authored-By: Claude Sonnet 4.6 <noreply@anthropic.com>
</commit_message>
<xml_diff>
--- a/doc/image-generation-workflow-guide.docx
+++ b/doc/image-generation-workflow-guide.docx
@@ -950,6 +950,682 @@
     </w:p>
     <w:p>
       <w:r>
+        <w:rPr>
+          <w:rFonts w:ascii="TH Sarabun New" w:hAnsi="TH Sarabun New" w:eastAsia="TH Sarabun New"/>
+          <w:b/>
+          <w:sz w:val="44"/>
+        </w:rPr>
+        <w:t>บทสวดใช้งานจริงในช่องแชท</w:t>
+      </w:r>
+    </w:p>
+    <w:p>
+      <w:r>
+        <w:rPr>
+          <w:rFonts w:ascii="TH Sarabun New" w:hAnsi="TH Sarabun New" w:eastAsia="TH Sarabun New"/>
+          <w:b w:val="0"/>
+          <w:sz w:val="32"/>
+        </w:rPr>
+        <w:t>ใช้หัวข้อนี้เป็นตัวอย่างคำสั่งแบบ copy/paste สำหรับทีมงาน สั่งทีละรอบ ตรวจทีละรอบ และยังไม่ข้ามไป final render จนกว่า draft/layout จะผ่าน</w:t>
+      </w:r>
+    </w:p>
+    <w:p>
+      <w:r>
+        <w:rPr>
+          <w:rFonts w:ascii="TH Sarabun New" w:hAnsi="TH Sarabun New" w:eastAsia="TH Sarabun New"/>
+          <w:b/>
+          <w:sz w:val="36"/>
+        </w:rPr>
+        <w:t>รอบที่ 1 — เปิดงาน</w:t>
+      </w:r>
+    </w:p>
+    <w:p>
+      <w:pPr>
+        <w:ind w:left="340"/>
+      </w:pPr>
+      <w:r>
+        <w:rPr>
+          <w:rFonts w:ascii="TH Sarabun New" w:hAnsi="TH Sarabun New" w:eastAsia="TH Sarabun New"/>
+          <w:b/>
+          <w:sz w:val="30"/>
+        </w:rPr>
+        <w:t>START JOB: ป้ายที่ 1 ป้ายเปิดตัวระบบจอง</w:t>
+      </w:r>
+    </w:p>
+    <w:p>
+      <w:pPr>
+        <w:pStyle w:val="ListBullet"/>
+      </w:pPr>
+      <w:r>
+        <w:rPr>
+          <w:rFonts w:ascii="TH Sarabun New" w:hAnsi="TH Sarabun New" w:eastAsia="TH Sarabun New"/>
+          <w:b w:val="0"/>
+          <w:sz w:val="32"/>
+        </w:rPr>
+        <w:t>รอ Codex สรุปป้าย อ่าน poster-plan/progress เช็ก asset และเช็ก git</w:t>
+      </w:r>
+    </w:p>
+    <w:p>
+      <w:pPr>
+        <w:pStyle w:val="ListBullet"/>
+      </w:pPr>
+      <w:r>
+        <w:rPr>
+          <w:rFonts w:ascii="TH Sarabun New" w:hAnsi="TH Sarabun New" w:eastAsia="TH Sarabun New"/>
+          <w:b w:val="0"/>
+          <w:sz w:val="32"/>
+        </w:rPr>
+        <w:t>ทีมตรวจว่า Codex เข้าใจป้ายถูกใบและยังไม่ข้ามไป final render</w:t>
+      </w:r>
+    </w:p>
+    <w:p>
+      <w:r>
+        <w:rPr>
+          <w:rFonts w:ascii="TH Sarabun New" w:hAnsi="TH Sarabun New" w:eastAsia="TH Sarabun New"/>
+          <w:b/>
+          <w:sz w:val="36"/>
+        </w:rPr>
+        <w:t>รอบที่ 2 — ตรวจองค์ประกอบ</w:t>
+      </w:r>
+    </w:p>
+    <w:p>
+      <w:pPr>
+        <w:ind w:left="340"/>
+      </w:pPr>
+      <w:r>
+        <w:rPr>
+          <w:rFonts w:ascii="TH Sarabun New" w:hAnsi="TH Sarabun New" w:eastAsia="TH Sarabun New"/>
+          <w:b/>
+          <w:sz w:val="30"/>
+        </w:rPr>
+        <w:t>CHECK ASSETS: ป้ายที่ 1 ใช้ไฟล์ใน doc/illustrations</w:t>
+      </w:r>
+    </w:p>
+    <w:p>
+      <w:pPr>
+        <w:pStyle w:val="ListBullet"/>
+      </w:pPr>
+      <w:r>
+        <w:rPr>
+          <w:rFonts w:ascii="TH Sarabun New" w:hAnsi="TH Sarabun New" w:eastAsia="TH Sarabun New"/>
+          <w:b w:val="0"/>
+          <w:sz w:val="32"/>
+        </w:rPr>
+        <w:t>รอ Codex แยกไฟล์ฉาก ตัวละคร โลโก้จริง QR จริง และ mood/tone reference</w:t>
+      </w:r>
+    </w:p>
+    <w:p>
+      <w:pPr>
+        <w:pStyle w:val="ListBullet"/>
+      </w:pPr>
+      <w:r>
+        <w:rPr>
+          <w:rFonts w:ascii="TH Sarabun New" w:hAnsi="TH Sarabun New" w:eastAsia="TH Sarabun New"/>
+          <w:b w:val="0"/>
+          <w:sz w:val="32"/>
+        </w:rPr>
+        <w:t>ทีมตรวจว่า QR/โลโก้เป็นไฟล์ล่าสุด และภาพบุคลากรได้รับอนุญาตให้ใช้</w:t>
+      </w:r>
+    </w:p>
+    <w:p>
+      <w:r>
+        <w:rPr>
+          <w:rFonts w:ascii="TH Sarabun New" w:hAnsi="TH Sarabun New" w:eastAsia="TH Sarabun New"/>
+          <w:b/>
+          <w:sz w:val="36"/>
+        </w:rPr>
+        <w:t>รอบที่ 3 — ทำ brief</w:t>
+      </w:r>
+    </w:p>
+    <w:p>
+      <w:pPr>
+        <w:ind w:left="340"/>
+      </w:pPr>
+      <w:r>
+        <w:rPr>
+          <w:rFonts w:ascii="TH Sarabun New" w:hAnsi="TH Sarabun New" w:eastAsia="TH Sarabun New"/>
+          <w:b/>
+          <w:sz w:val="30"/>
+        </w:rPr>
+        <w:t>MAKE BRIEF: ป้ายที่ 1 ใช้โทน ARC/NPU ใส่ QR จริง 2 ช่องทาง และให้ personal_akeky เป็นมุม support</w:t>
+      </w:r>
+    </w:p>
+    <w:p>
+      <w:pPr>
+        <w:pStyle w:val="ListBullet"/>
+      </w:pPr>
+      <w:r>
+        <w:rPr>
+          <w:rFonts w:ascii="TH Sarabun New" w:hAnsi="TH Sarabun New" w:eastAsia="TH Sarabun New"/>
+          <w:b w:val="0"/>
+          <w:sz w:val="32"/>
+        </w:rPr>
+        <w:t>รอ Codex สรุปเป้าหมาย กลุ่มเป้าหมาย ข้อความหลัก mood/tone layout คร่าว ๆ และข้อห้าม</w:t>
+      </w:r>
+    </w:p>
+    <w:p>
+      <w:pPr>
+        <w:pStyle w:val="ListBullet"/>
+      </w:pPr>
+      <w:r>
+        <w:rPr>
+          <w:rFonts w:ascii="TH Sarabun New" w:hAnsi="TH Sarabun New" w:eastAsia="TH Sarabun New"/>
+          <w:b w:val="0"/>
+          <w:sz w:val="32"/>
+        </w:rPr>
+        <w:t>ทีมตรวจว่าข้อความถูก, LINE OA เป็นช่องทางหลัก, QR เว็บไซต์เป็นช่องทางรอง และ personal_akeky ไม่เด่นเกินไป</w:t>
+      </w:r>
+    </w:p>
+    <w:p>
+      <w:pPr>
+        <w:pStyle w:val="ListBullet"/>
+      </w:pPr>
+      <w:r>
+        <w:rPr>
+          <w:rFonts w:ascii="TH Sarabun New" w:hAnsi="TH Sarabun New" w:eastAsia="TH Sarabun New"/>
+          <w:b w:val="0"/>
+          <w:sz w:val="32"/>
+        </w:rPr>
+        <w:t>ถ้าผ่าน ให้ตอบว่า: อนุมัติ brief</w:t>
+      </w:r>
+    </w:p>
+    <w:p>
+      <w:r>
+        <w:rPr>
+          <w:rFonts w:ascii="TH Sarabun New" w:hAnsi="TH Sarabun New" w:eastAsia="TH Sarabun New"/>
+          <w:b/>
+          <w:sz w:val="36"/>
+        </w:rPr>
+        <w:t>รอบที่ 4 — ทำร่างเร็ว</w:t>
+      </w:r>
+    </w:p>
+    <w:p>
+      <w:pPr>
+        <w:ind w:left="340"/>
+      </w:pPr>
+      <w:r>
+        <w:rPr>
+          <w:rFonts w:ascii="TH Sarabun New" w:hAnsi="TH Sarabun New" w:eastAsia="TH Sarabun New"/>
+          <w:b/>
+          <w:sz w:val="30"/>
+        </w:rPr>
+        <w:t>DRAFT LOW: ป้ายที่ 1 A3 แนวตั้ง เห็นตำแหน่งหัวข้อ โลโก้ QR และตัวละคร</w:t>
+      </w:r>
+    </w:p>
+    <w:p>
+      <w:pPr>
+        <w:pStyle w:val="ListBullet"/>
+      </w:pPr>
+      <w:r>
+        <w:rPr>
+          <w:rFonts w:ascii="TH Sarabun New" w:hAnsi="TH Sarabun New" w:eastAsia="TH Sarabun New"/>
+          <w:b w:val="0"/>
+          <w:sz w:val="32"/>
+        </w:rPr>
+        <w:t>รอภาพร่างหรือ wireframe คุณภาพต่ำที่เห็นตำแหน่งหัวข้อ โลโก้ QR ตัวละคร และลำดับสายตา</w:t>
+      </w:r>
+    </w:p>
+    <w:p>
+      <w:pPr>
+        <w:pStyle w:val="ListBullet"/>
+      </w:pPr>
+      <w:r>
+        <w:rPr>
+          <w:rFonts w:ascii="TH Sarabun New" w:hAnsi="TH Sarabun New" w:eastAsia="TH Sarabun New"/>
+          <w:b w:val="0"/>
+          <w:sz w:val="32"/>
+        </w:rPr>
+        <w:t>ทีมตรวจว่ามองแวบแรกเข้าใจไหม, QR เด่นไหม, พื้นที่โล่งพอไหม และ layout แน่นไปไหม</w:t>
+      </w:r>
+    </w:p>
+    <w:p>
+      <w:r>
+        <w:rPr>
+          <w:rFonts w:ascii="TH Sarabun New" w:hAnsi="TH Sarabun New" w:eastAsia="TH Sarabun New"/>
+          <w:b/>
+          <w:sz w:val="36"/>
+        </w:rPr>
+        <w:t>รอบที่ 5 — ทำ layout draft</w:t>
+      </w:r>
+    </w:p>
+    <w:p>
+      <w:pPr>
+        <w:ind w:left="340"/>
+      </w:pPr>
+      <w:r>
+        <w:rPr>
+          <w:rFonts w:ascii="TH Sarabun New" w:hAnsi="TH Sarabun New" w:eastAsia="TH Sarabun New"/>
+          <w:b/>
+          <w:sz w:val="30"/>
+        </w:rPr>
+        <w:t>LAYOUT DRAFT: ป้ายที่ 1 ใส่ข้อความจริง โลโก้จริง QR จริง และ export PNG สำหรับตรวจ</w:t>
+      </w:r>
+    </w:p>
+    <w:p>
+      <w:pPr>
+        <w:pStyle w:val="ListBullet"/>
+      </w:pPr>
+      <w:r>
+        <w:rPr>
+          <w:rFonts w:ascii="TH Sarabun New" w:hAnsi="TH Sarabun New" w:eastAsia="TH Sarabun New"/>
+          <w:b w:val="0"/>
+          <w:sz w:val="32"/>
+        </w:rPr>
+        <w:t>รอไฟล์ mockup ที่มีข้อความจริง, logo_NPU, logo_ARC, QR_LINEOA_ARC และ QR_WebApp_ARC</w:t>
+      </w:r>
+    </w:p>
+    <w:p>
+      <w:pPr>
+        <w:pStyle w:val="ListBullet"/>
+      </w:pPr>
+      <w:r>
+        <w:rPr>
+          <w:rFonts w:ascii="TH Sarabun New" w:hAnsi="TH Sarabun New" w:eastAsia="TH Sarabun New"/>
+          <w:b w:val="0"/>
+          <w:sz w:val="32"/>
+        </w:rPr>
+        <w:t>ทีมตรวจคำไทย ขนาดตัวอักษร โลโก้ QR และลองสแกนจากไฟล์ draft</w:t>
+      </w:r>
+    </w:p>
+    <w:p>
+      <w:r>
+        <w:rPr>
+          <w:rFonts w:ascii="TH Sarabun New" w:hAnsi="TH Sarabun New" w:eastAsia="TH Sarabun New"/>
+          <w:b/>
+          <w:sz w:val="36"/>
+        </w:rPr>
+        <w:t>รอบที่ 6 — ตรวจร่าง</w:t>
+      </w:r>
+    </w:p>
+    <w:p>
+      <w:pPr>
+        <w:ind w:left="340"/>
+      </w:pPr>
+      <w:r>
+        <w:rPr>
+          <w:rFonts w:ascii="TH Sarabun New" w:hAnsi="TH Sarabun New" w:eastAsia="TH Sarabun New"/>
+          <w:b/>
+          <w:sz w:val="30"/>
+        </w:rPr>
+        <w:t>REVIEW DRAFT: ทดสอบ QR แล้ว LINE OA ใช้ได้ เว็บใช้ได้ ข้อความโอเค</w:t>
+      </w:r>
+    </w:p>
+    <w:p>
+      <w:pPr>
+        <w:pStyle w:val="ListBullet"/>
+      </w:pPr>
+      <w:r>
+        <w:rPr>
+          <w:rFonts w:ascii="TH Sarabun New" w:hAnsi="TH Sarabun New" w:eastAsia="TH Sarabun New"/>
+          <w:b w:val="0"/>
+          <w:sz w:val="32"/>
+        </w:rPr>
+        <w:t>ถ้ายังไม่ผ่าน ให้ระบุปัญหา เช่น QR เล็กไป หัวข้อไม่เด่น ข้อความแน่น</w:t>
+      </w:r>
+    </w:p>
+    <w:p>
+      <w:pPr>
+        <w:pStyle w:val="ListBullet"/>
+      </w:pPr>
+      <w:r>
+        <w:rPr>
+          <w:rFonts w:ascii="TH Sarabun New" w:hAnsi="TH Sarabun New" w:eastAsia="TH Sarabun New"/>
+          <w:b w:val="0"/>
+          <w:sz w:val="32"/>
+        </w:rPr>
+        <w:t>รอ Codex สรุปว่าผ่านหรือยังไม่ผ่าน และเสนอรายการแก้รอบถัดไป</w:t>
+      </w:r>
+    </w:p>
+    <w:p>
+      <w:r>
+        <w:rPr>
+          <w:rFonts w:ascii="TH Sarabun New" w:hAnsi="TH Sarabun New" w:eastAsia="TH Sarabun New"/>
+          <w:b/>
+          <w:sz w:val="36"/>
+        </w:rPr>
+        <w:t>รอบที่ 7 — final render</w:t>
+      </w:r>
+    </w:p>
+    <w:p>
+      <w:pPr>
+        <w:ind w:left="340"/>
+      </w:pPr>
+      <w:r>
+        <w:rPr>
+          <w:rFonts w:ascii="TH Sarabun New" w:hAnsi="TH Sarabun New" w:eastAsia="TH Sarabun New"/>
+          <w:b/>
+          <w:sz w:val="30"/>
+        </w:rPr>
+        <w:t>FINAL RENDER: ป้ายที่ 1 ใช้ layout ที่อนุมัติแล้ว ห้ามเปลี่ยนโครง</w:t>
+      </w:r>
+    </w:p>
+    <w:p>
+      <w:pPr>
+        <w:pStyle w:val="ListBullet"/>
+      </w:pPr>
+      <w:r>
+        <w:rPr>
+          <w:rFonts w:ascii="TH Sarabun New" w:hAnsi="TH Sarabun New" w:eastAsia="TH Sarabun New"/>
+          <w:b w:val="0"/>
+          <w:sz w:val="32"/>
+        </w:rPr>
+        <w:t>รอภาพประกอบคุณภาพสูงหรือ final artwork ที่ไม่เปลี่ยนตำแหน่งหลักโดยพลการ</w:t>
+      </w:r>
+    </w:p>
+    <w:p>
+      <w:pPr>
+        <w:pStyle w:val="ListBullet"/>
+      </w:pPr>
+      <w:r>
+        <w:rPr>
+          <w:rFonts w:ascii="TH Sarabun New" w:hAnsi="TH Sarabun New" w:eastAsia="TH Sarabun New"/>
+          <w:b w:val="0"/>
+          <w:sz w:val="32"/>
+        </w:rPr>
+        <w:t>ทีมตรวจคุณภาพภาพ mood/tone และ artifact ก่อน export</w:t>
+      </w:r>
+    </w:p>
+    <w:p>
+      <w:r>
+        <w:rPr>
+          <w:rFonts w:ascii="TH Sarabun New" w:hAnsi="TH Sarabun New" w:eastAsia="TH Sarabun New"/>
+          <w:b/>
+          <w:sz w:val="36"/>
+        </w:rPr>
+        <w:t>รอบที่ 8 — export</w:t>
+      </w:r>
+    </w:p>
+    <w:p>
+      <w:pPr>
+        <w:ind w:left="340"/>
+      </w:pPr>
+      <w:r>
+        <w:rPr>
+          <w:rFonts w:ascii="TH Sarabun New" w:hAnsi="TH Sarabun New" w:eastAsia="TH Sarabun New"/>
+          <w:b/>
+          <w:sz w:val="30"/>
+        </w:rPr>
+        <w:t>EXPORT: ป้ายที่ 1 A3 print และ PNG web พร้อมไฟล์ source</w:t>
+      </w:r>
+    </w:p>
+    <w:p>
+      <w:pPr>
+        <w:pStyle w:val="ListBullet"/>
+      </w:pPr>
+      <w:r>
+        <w:rPr>
+          <w:rFonts w:ascii="TH Sarabun New" w:hAnsi="TH Sarabun New" w:eastAsia="TH Sarabun New"/>
+          <w:b w:val="0"/>
+          <w:sz w:val="32"/>
+        </w:rPr>
+        <w:t>รอไฟล์ print, web/social, source และรายงานว่าใช้โลโก้/QR จริงครบ</w:t>
+      </w:r>
+    </w:p>
+    <w:p>
+      <w:pPr>
+        <w:pStyle w:val="ListBullet"/>
+      </w:pPr>
+      <w:r>
+        <w:rPr>
+          <w:rFonts w:ascii="TH Sarabun New" w:hAnsi="TH Sarabun New" w:eastAsia="TH Sarabun New"/>
+          <w:b w:val="0"/>
+          <w:sz w:val="32"/>
+        </w:rPr>
+        <w:t>ทีมตรวจเปิดไฟล์ final และสแกน QR จากไฟล์ final อีกครั้ง</w:t>
+      </w:r>
+    </w:p>
+    <w:p>
+      <w:r>
+        <w:rPr>
+          <w:rFonts w:ascii="TH Sarabun New" w:hAnsi="TH Sarabun New" w:eastAsia="TH Sarabun New"/>
+          <w:b/>
+          <w:sz w:val="36"/>
+        </w:rPr>
+        <w:t>รอบที่ 9 — บันทึกงาน</w:t>
+      </w:r>
+    </w:p>
+    <w:p>
+      <w:pPr>
+        <w:ind w:left="340"/>
+      </w:pPr>
+      <w:r>
+        <w:rPr>
+          <w:rFonts w:ascii="TH Sarabun New" w:hAnsi="TH Sarabun New" w:eastAsia="TH Sarabun New"/>
+          <w:b/>
+          <w:sz w:val="30"/>
+        </w:rPr>
+        <w:t>RECORD JOB: ป้ายที่ 1 ผ่านการทดสอบ QR ข้อความ และไฟล์ export แล้ว</w:t>
+      </w:r>
+    </w:p>
+    <w:p>
+      <w:pPr>
+        <w:pStyle w:val="ListBullet"/>
+      </w:pPr>
+      <w:r>
+        <w:rPr>
+          <w:rFonts w:ascii="TH Sarabun New" w:hAnsi="TH Sarabun New" w:eastAsia="TH Sarabun New"/>
+          <w:b w:val="0"/>
+          <w:sz w:val="32"/>
+        </w:rPr>
+        <w:t>รอ Codex อัปเดต poster-plan/progress และบันทึก path ของไฟล์ final</w:t>
+      </w:r>
+    </w:p>
+    <w:p>
+      <w:pPr>
+        <w:pStyle w:val="ListBullet"/>
+      </w:pPr>
+      <w:r>
+        <w:rPr>
+          <w:rFonts w:ascii="TH Sarabun New" w:hAnsi="TH Sarabun New" w:eastAsia="TH Sarabun New"/>
+          <w:b w:val="0"/>
+          <w:sz w:val="32"/>
+        </w:rPr>
+        <w:t>ทีมตรวจว่าเอกสารตรงกับผลทดสอบจริง ก่อนอนุมัติ commit/push</w:t>
+      </w:r>
+    </w:p>
+    <w:p>
+      <w:r>
+        <w:rPr>
+          <w:rFonts w:ascii="TH Sarabun New" w:hAnsi="TH Sarabun New" w:eastAsia="TH Sarabun New"/>
+          <w:b/>
+          <w:sz w:val="36"/>
+        </w:rPr>
+        <w:t>รอบที่ 10 — ปิดงาน</w:t>
+      </w:r>
+    </w:p>
+    <w:p>
+      <w:pPr>
+        <w:ind w:left="340"/>
+      </w:pPr>
+      <w:r>
+        <w:rPr>
+          <w:rFonts w:ascii="TH Sarabun New" w:hAnsi="TH Sarabun New" w:eastAsia="TH Sarabun New"/>
+          <w:b/>
+          <w:sz w:val="30"/>
+        </w:rPr>
+        <w:t>END JOB: ป้ายที่ 1</w:t>
+      </w:r>
+    </w:p>
+    <w:p>
+      <w:pPr>
+        <w:pStyle w:val="ListBullet"/>
+      </w:pPr>
+      <w:r>
+        <w:rPr>
+          <w:rFonts w:ascii="TH Sarabun New" w:hAnsi="TH Sarabun New" w:eastAsia="TH Sarabun New"/>
+          <w:b w:val="0"/>
+          <w:sz w:val="32"/>
+        </w:rPr>
+        <w:t>รอ Codex สรุปไฟล์ final, source, commit ล่าสุด และสิ่งที่ยังค้าง</w:t>
+      </w:r>
+    </w:p>
+    <w:p>
+      <w:pPr>
+        <w:pStyle w:val="ListBullet"/>
+      </w:pPr>
+      <w:r>
+        <w:rPr>
+          <w:rFonts w:ascii="TH Sarabun New" w:hAnsi="TH Sarabun New" w:eastAsia="TH Sarabun New"/>
+          <w:b w:val="0"/>
+          <w:sz w:val="32"/>
+        </w:rPr>
+        <w:t>Codex ต้องไม่เปิดงานใหม่เองหลังปิดงาน</w:t>
+      </w:r>
+    </w:p>
+    <w:p>
+      <w:r>
+        <w:rPr>
+          <w:rFonts w:ascii="TH Sarabun New" w:hAnsi="TH Sarabun New" w:eastAsia="TH Sarabun New"/>
+          <w:b/>
+          <w:sz w:val="36"/>
+        </w:rPr>
+        <w:t>ชุดคำสั่งเต็มสำหรับป้ายที่ 1</w:t>
+      </w:r>
+    </w:p>
+    <w:p>
+      <w:pPr>
+        <w:ind w:left="340"/>
+      </w:pPr>
+      <w:r>
+        <w:rPr>
+          <w:rFonts w:ascii="TH Sarabun New" w:hAnsi="TH Sarabun New" w:eastAsia="TH Sarabun New"/>
+          <w:b/>
+          <w:sz w:val="30"/>
+        </w:rPr>
+        <w:t>START JOB: ป้ายที่ 1 ป้ายเปิดตัวระบบจอง</w:t>
+      </w:r>
+    </w:p>
+    <w:p>
+      <w:pPr>
+        <w:ind w:left="340"/>
+      </w:pPr>
+      <w:r>
+        <w:rPr>
+          <w:rFonts w:ascii="TH Sarabun New" w:hAnsi="TH Sarabun New" w:eastAsia="TH Sarabun New"/>
+          <w:b/>
+          <w:sz w:val="30"/>
+        </w:rPr>
+        <w:t>CHECK ASSETS: ป้ายที่ 1 ใช้ไฟล์ใน doc/illustrations</w:t>
+      </w:r>
+    </w:p>
+    <w:p>
+      <w:pPr>
+        <w:ind w:left="340"/>
+      </w:pPr>
+      <w:r>
+        <w:rPr>
+          <w:rFonts w:ascii="TH Sarabun New" w:hAnsi="TH Sarabun New" w:eastAsia="TH Sarabun New"/>
+          <w:b/>
+          <w:sz w:val="30"/>
+        </w:rPr>
+        <w:t>MAKE BRIEF: ป้ายที่ 1 ใช้โทน ARC/NPU ใส่ QR จริง 2 ช่องทาง และให้ personal_akeky เป็นมุม support</w:t>
+      </w:r>
+    </w:p>
+    <w:p>
+      <w:pPr>
+        <w:ind w:left="340"/>
+      </w:pPr>
+      <w:r>
+        <w:rPr>
+          <w:rFonts w:ascii="TH Sarabun New" w:hAnsi="TH Sarabun New" w:eastAsia="TH Sarabun New"/>
+          <w:b/>
+          <w:sz w:val="30"/>
+        </w:rPr>
+        <w:t>อนุมัติ brief</w:t>
+      </w:r>
+    </w:p>
+    <w:p>
+      <w:pPr>
+        <w:ind w:left="340"/>
+      </w:pPr>
+      <w:r>
+        <w:rPr>
+          <w:rFonts w:ascii="TH Sarabun New" w:hAnsi="TH Sarabun New" w:eastAsia="TH Sarabun New"/>
+          <w:b/>
+          <w:sz w:val="30"/>
+        </w:rPr>
+        <w:t>DRAFT LOW: ป้ายที่ 1 A3 แนวตั้ง เห็นตำแหน่งหัวข้อ โลโก้ QR และตัวละคร</w:t>
+      </w:r>
+    </w:p>
+    <w:p>
+      <w:pPr>
+        <w:ind w:left="340"/>
+      </w:pPr>
+      <w:r>
+        <w:rPr>
+          <w:rFonts w:ascii="TH Sarabun New" w:hAnsi="TH Sarabun New" w:eastAsia="TH Sarabun New"/>
+          <w:b/>
+          <w:sz w:val="30"/>
+        </w:rPr>
+        <w:t>LAYOUT DRAFT: ป้ายที่ 1 ใส่ข้อความจริง โลโก้จริง QR จริง และ export PNG สำหรับตรวจ</w:t>
+      </w:r>
+    </w:p>
+    <w:p>
+      <w:pPr>
+        <w:ind w:left="340"/>
+      </w:pPr>
+      <w:r>
+        <w:rPr>
+          <w:rFonts w:ascii="TH Sarabun New" w:hAnsi="TH Sarabun New" w:eastAsia="TH Sarabun New"/>
+          <w:b/>
+          <w:sz w:val="30"/>
+        </w:rPr>
+        <w:t>REVIEW DRAFT: ทดสอบ QR แล้ว LINE OA ใช้ได้ เว็บใช้ได้ ข้อความโอเค</w:t>
+      </w:r>
+    </w:p>
+    <w:p>
+      <w:pPr>
+        <w:ind w:left="340"/>
+      </w:pPr>
+      <w:r>
+        <w:rPr>
+          <w:rFonts w:ascii="TH Sarabun New" w:hAnsi="TH Sarabun New" w:eastAsia="TH Sarabun New"/>
+          <w:b/>
+          <w:sz w:val="30"/>
+        </w:rPr>
+        <w:t>FINAL RENDER: ป้ายที่ 1 ใช้ layout ที่อนุมัติแล้ว ห้ามเปลี่ยนโครง</w:t>
+      </w:r>
+    </w:p>
+    <w:p>
+      <w:pPr>
+        <w:ind w:left="340"/>
+      </w:pPr>
+      <w:r>
+        <w:rPr>
+          <w:rFonts w:ascii="TH Sarabun New" w:hAnsi="TH Sarabun New" w:eastAsia="TH Sarabun New"/>
+          <w:b/>
+          <w:sz w:val="30"/>
+        </w:rPr>
+        <w:t>EXPORT: ป้ายที่ 1 A3 print และ PNG web พร้อมไฟล์ source</w:t>
+      </w:r>
+    </w:p>
+    <w:p>
+      <w:pPr>
+        <w:ind w:left="340"/>
+      </w:pPr>
+      <w:r>
+        <w:rPr>
+          <w:rFonts w:ascii="TH Sarabun New" w:hAnsi="TH Sarabun New" w:eastAsia="TH Sarabun New"/>
+          <w:b/>
+          <w:sz w:val="30"/>
+        </w:rPr>
+        <w:t>RECORD JOB: ป้ายที่ 1 ผ่านการทดสอบ QR ข้อความ และไฟล์ export แล้ว</w:t>
+      </w:r>
+    </w:p>
+    <w:p>
+      <w:pPr>
+        <w:ind w:left="340"/>
+      </w:pPr>
+      <w:r>
+        <w:rPr>
+          <w:rFonts w:ascii="TH Sarabun New" w:hAnsi="TH Sarabun New" w:eastAsia="TH Sarabun New"/>
+          <w:b/>
+          <w:sz w:val="30"/>
+        </w:rPr>
+        <w:t>END JOB: ป้ายที่ 1</w:t>
+      </w:r>
+    </w:p>
+    <w:p>
+      <w:r>
         <w:br w:type="page"/>
       </w:r>
     </w:p>

</xml_diff>